<commit_message>
Append exercise 3 section to dockerization doc
Move the Exercice 3 content into the existing Exercice_1_Dockerization.docx
(continues numbering with Captures 10-17) instead of a separate file.
Also drop two obsolete Dockerfile variants that were already removed
from the working tree.

Co-Authored-By: Claude Opus 4.7 <noreply@anthropic.com>
</commit_message>
<xml_diff>
--- a/Exercice_1_Dockerization.docx
+++ b/Exercice_1_Dockerization.docx
@@ -1469,7 +1469,772 @@
         <w:br/>
         <w:t>docker images --format '{{.Repository}} {{.Tag}} {{.Size}}'</w:t>
       </w:r>
+      <w:r>
+        <w:br w:type="page"/>
+      </w:r>
     </w:p>
+    <w:p>
+      <w:pPr>
+        <w:pStyle w:val="Heading1"/>
+      </w:pPr>
+      <w:r>
+        <w:t>Exercice 3 - Verifier les images Docker produites</w:t>
+      </w:r>
+    </w:p>
+    <w:p>
+      <w:r>
+        <w:t xml:space="preserve">Apres l'exercice 2, la CI GitHub Actions publie automatiquement les images front et back sur GitHub Container Registry (GHCR) a chaque push sur la branche </w:t>
+      </w:r>
+      <w:r>
+        <w:rPr>
+          <w:rFonts w:ascii="Consolas" w:hAnsi="Consolas"/>
+        </w:rPr>
+        <w:t>main</w:t>
+      </w:r>
+      <w:r>
+        <w:t>. Les images sont disponibles aux references :</w:t>
+      </w:r>
+    </w:p>
+    <w:tbl>
+      <w:tblPr>
+        <w:tblW w:type="auto" w:w="0"/>
+        <w:tblLook w:firstColumn="1" w:firstRow="1" w:lastColumn="0" w:lastRow="0" w:noHBand="0" w:noVBand="1" w:val="04A0"/>
+      </w:tblPr>
+      <w:tblGrid>
+        <w:gridCol w:w="9360"/>
+      </w:tblGrid>
+      <w:tr>
+        <w:tc>
+          <w:tcPr>
+            <w:tcW w:type="dxa" w:w="9360"/>
+            <w:shd w:val="clear" w:color="auto" w:fill="F7F7F7"/>
+          </w:tcPr>
+          <w:p>
+            <w:r/>
+            <w:r>
+              <w:rPr>
+                <w:rFonts w:ascii="Consolas" w:hAnsi="Consolas"/>
+                <w:sz w:val="20"/>
+              </w:rPr>
+              <w:t>ghcr.io/hrivaux/mfp-docker-ci-server:latest</w:t>
+              <w:br/>
+              <w:t>ghcr.io/hrivaux/mfp-docker-ci-client:latest</w:t>
+            </w:r>
+          </w:p>
+        </w:tc>
+      </w:tr>
+    </w:tbl>
+    <w:p>
+      <w:r>
+        <w:t xml:space="preserve">Un fichier </w:t>
+      </w:r>
+      <w:r>
+        <w:rPr>
+          <w:rFonts w:ascii="Consolas" w:hAnsi="Consolas"/>
+        </w:rPr>
+        <w:t>compose.prod.yml</w:t>
+      </w:r>
+      <w:r>
+        <w:t xml:space="preserve"> a ete cree a la racine du projet a partir de </w:t>
+      </w:r>
+      <w:r>
+        <w:rPr>
+          <w:rFonts w:ascii="Consolas" w:hAnsi="Consolas"/>
+        </w:rPr>
+        <w:t>compose.yml</w:t>
+      </w:r>
+      <w:r>
+        <w:t xml:space="preserve">. Les directives </w:t>
+      </w:r>
+      <w:r>
+        <w:rPr>
+          <w:rFonts w:ascii="Consolas" w:hAnsi="Consolas"/>
+        </w:rPr>
+        <w:t>build:</w:t>
+      </w:r>
+      <w:r>
+        <w:t xml:space="preserve"> ont ete remplacees par des directives </w:t>
+      </w:r>
+      <w:r>
+        <w:rPr>
+          <w:rFonts w:ascii="Consolas" w:hAnsi="Consolas"/>
+        </w:rPr>
+        <w:t>image:</w:t>
+      </w:r>
+      <w:r>
+        <w:t xml:space="preserve"> pointant sur les images GHCR. Aucune compilation locale n'est plus declenchee : Docker tire directement les images publiees.</w:t>
+      </w:r>
+    </w:p>
+    <w:p>
+      <w:pPr>
+        <w:pStyle w:val="Heading2"/>
+      </w:pPr>
+      <w:r>
+        <w:t>Contenu de compose.prod.yml</w:t>
+      </w:r>
+    </w:p>
+    <w:tbl>
+      <w:tblPr>
+        <w:tblW w:type="auto" w:w="0"/>
+        <w:tblLook w:firstColumn="1" w:firstRow="1" w:lastColumn="0" w:lastRow="0" w:noHBand="0" w:noVBand="1" w:val="04A0"/>
+      </w:tblPr>
+      <w:tblGrid>
+        <w:gridCol w:w="9360"/>
+      </w:tblGrid>
+      <w:tr>
+        <w:tc>
+          <w:tcPr>
+            <w:tcW w:type="dxa" w:w="9360"/>
+            <w:shd w:val="clear" w:color="auto" w:fill="F7F7F7"/>
+          </w:tcPr>
+          <w:p>
+            <w:r/>
+            <w:r>
+              <w:rPr>
+                <w:rFonts w:ascii="Consolas" w:hAnsi="Consolas"/>
+                <w:sz w:val="20"/>
+              </w:rPr>
+              <w:t>services:</w:t>
+              <w:br/>
+              <w:t xml:space="preserve">  db:</w:t>
+              <w:br/>
+              <w:t xml:space="preserve">    image: postgres:16-alpine</w:t>
+              <w:br/>
+              <w:t xml:space="preserve">    restart: unless-stopped</w:t>
+              <w:br/>
+              <w:t xml:space="preserve">    environment:</w:t>
+              <w:br/>
+              <w:t xml:space="preserve">      POSTGRES_USER: postgres</w:t>
+              <w:br/>
+              <w:t xml:space="preserve">      POSTGRES_PASSWORD: supersecret</w:t>
+              <w:br/>
+              <w:t xml:space="preserve">      POSTGRES_DB: postgres</w:t>
+              <w:br/>
+              <w:t xml:space="preserve">    volumes:</w:t>
+              <w:br/>
+              <w:t xml:space="preserve">      - postgres-data:/var/lib/postgresql/data</w:t>
+              <w:br/>
+              <w:t xml:space="preserve">    ports:</w:t>
+              <w:br/>
+              <w:t xml:space="preserve">      - "5432:5432"</w:t>
+              <w:br/>
+              <w:t xml:space="preserve">    healthcheck:</w:t>
+              <w:br/>
+              <w:t xml:space="preserve">      test: ["CMD-SHELL", "pg_isready -U postgres -d postgres"]</w:t>
+              <w:br/>
+              <w:t xml:space="preserve">      interval: 5s</w:t>
+              <w:br/>
+              <w:t xml:space="preserve">      timeout: 5s</w:t>
+              <w:br/>
+              <w:t xml:space="preserve">      retries: 10</w:t>
+              <w:br/>
+              <w:br/>
+              <w:t xml:space="preserve">  server:</w:t>
+              <w:br/>
+              <w:t xml:space="preserve">    image: ghcr.io/hrivaux/mfp-docker-ci-server:latest</w:t>
+              <w:br/>
+              <w:t xml:space="preserve">    restart: unless-stopped</w:t>
+              <w:br/>
+              <w:t xml:space="preserve">    environment:</w:t>
+              <w:br/>
+              <w:t xml:space="preserve">      PORT: 3000</w:t>
+              <w:br/>
+              <w:t xml:space="preserve">      DB_HOST: db</w:t>
+              <w:br/>
+              <w:t xml:space="preserve">      DB_PORT: 5432</w:t>
+              <w:br/>
+              <w:t xml:space="preserve">      DB_USER: postgres</w:t>
+              <w:br/>
+              <w:t xml:space="preserve">      DB_PASSWORD: supersecret</w:t>
+              <w:br/>
+              <w:t xml:space="preserve">      DB_NAME: postgres</w:t>
+              <w:br/>
+              <w:t xml:space="preserve">      SESSION_SECRET: change-me-in-production</w:t>
+              <w:br/>
+              <w:t xml:space="preserve">    ports:</w:t>
+              <w:br/>
+              <w:t xml:space="preserve">      - "3001:3000"</w:t>
+              <w:br/>
+              <w:t xml:space="preserve">    depends_on:</w:t>
+              <w:br/>
+              <w:t xml:space="preserve">      db:</w:t>
+              <w:br/>
+              <w:t xml:space="preserve">        condition: service_healthy</w:t>
+              <w:br/>
+              <w:br/>
+              <w:t xml:space="preserve">  client:</w:t>
+              <w:br/>
+              <w:t xml:space="preserve">    image: ghcr.io/hrivaux/mfp-docker-ci-client:latest</w:t>
+              <w:br/>
+              <w:t xml:space="preserve">    restart: unless-stopped</w:t>
+              <w:br/>
+              <w:t xml:space="preserve">    ports:</w:t>
+              <w:br/>
+              <w:t xml:space="preserve">      - "8080:80"</w:t>
+              <w:br/>
+              <w:t xml:space="preserve">    depends_on:</w:t>
+              <w:br/>
+              <w:t xml:space="preserve">      - server</w:t>
+              <w:br/>
+              <w:br/>
+              <w:t>volumes:</w:t>
+              <w:br/>
+              <w:t xml:space="preserve">  postgres-data:</w:t>
+            </w:r>
+          </w:p>
+        </w:tc>
+      </w:tr>
+    </w:tbl>
+    <w:p>
+      <w:pPr>
+        <w:pStyle w:val="Heading2"/>
+      </w:pPr>
+      <w:r>
+        <w:t>Verification</w:t>
+      </w:r>
+    </w:p>
+    <w:p>
+      <w:r>
+        <w:t>On arrete la stack precedente puis on lance la version de production :</w:t>
+      </w:r>
+    </w:p>
+    <w:tbl>
+      <w:tblPr>
+        <w:tblW w:type="auto" w:w="0"/>
+        <w:tblLook w:firstColumn="1" w:firstRow="1" w:lastColumn="0" w:lastRow="0" w:noHBand="0" w:noVBand="1" w:val="04A0"/>
+      </w:tblPr>
+      <w:tblGrid>
+        <w:gridCol w:w="9360"/>
+      </w:tblGrid>
+      <w:tr>
+        <w:tc>
+          <w:tcPr>
+            <w:tcW w:type="dxa" w:w="9360"/>
+            <w:shd w:val="clear" w:color="auto" w:fill="F7F7F7"/>
+          </w:tcPr>
+          <w:p>
+            <w:r/>
+            <w:r>
+              <w:rPr>
+                <w:rFonts w:ascii="Consolas" w:hAnsi="Consolas"/>
+                <w:sz w:val="20"/>
+              </w:rPr>
+              <w:t>docker compose down</w:t>
+              <w:br/>
+              <w:t>docker compose -f compose.prod.yml up -d</w:t>
+            </w:r>
+          </w:p>
+        </w:tc>
+      </w:tr>
+    </w:tbl>
+    <w:p>
+      <w:r>
+        <w:t>Verifications faites apres le demarrage :</w:t>
+      </w:r>
+    </w:p>
+    <w:tbl>
+      <w:tblPr>
+        <w:tblW w:type="auto" w:w="0"/>
+        <w:tblLook w:firstColumn="1" w:firstRow="1" w:lastColumn="0" w:lastRow="0" w:noHBand="0" w:noVBand="1" w:val="04A0"/>
+      </w:tblPr>
+      <w:tblGrid>
+        <w:gridCol w:w="9360"/>
+      </w:tblGrid>
+      <w:tr>
+        <w:tc>
+          <w:tcPr>
+            <w:tcW w:type="dxa" w:w="9360"/>
+            <w:shd w:val="clear" w:color="auto" w:fill="F7F7F7"/>
+          </w:tcPr>
+          <w:p>
+            <w:r/>
+            <w:r>
+              <w:rPr>
+                <w:rFonts w:ascii="Consolas" w:hAnsi="Consolas"/>
+                <w:sz w:val="20"/>
+              </w:rPr>
+              <w:t>docker compose -f compose.prod.yml ps</w:t>
+              <w:br/>
+              <w:t>docker compose -f compose.prod.yml logs server | tail -n 20</w:t>
+              <w:br/>
+              <w:t>curl -i http://localhost:8080</w:t>
+              <w:br/>
+              <w:t>curl -i -X POST http://localhost:3001/api/users \</w:t>
+              <w:br/>
+              <w:t xml:space="preserve">  -H 'Content-Type: application/json' \</w:t>
+              <w:br/>
+              <w:t xml:space="preserve">  -d '{"email":"prod-test@example.com","password":"secret123"}'</w:t>
+            </w:r>
+          </w:p>
+        </w:tc>
+      </w:tr>
+    </w:tbl>
+    <w:p>
+      <w:r>
+        <w:t xml:space="preserve">Resultat : la base est healthy, le serveur affiche </w:t>
+      </w:r>
+      <w:r>
+        <w:rPr>
+          <w:rFonts w:ascii="Consolas" w:hAnsi="Consolas"/>
+        </w:rPr>
+        <w:t>connected to PgSQL db</w:t>
+      </w:r>
+      <w:r>
+        <w:t xml:space="preserve"> puis </w:t>
+      </w:r>
+      <w:r>
+        <w:rPr>
+          <w:rFonts w:ascii="Consolas" w:hAnsi="Consolas"/>
+        </w:rPr>
+        <w:t>server started on port 3000</w:t>
+      </w:r>
+      <w:r>
+        <w:t>, le front repond en HTTP 200 sur le port 8080 et la requete POST /api/users renvoie HTTP 200. La chaine complete fonctionne uniquement avec les images publiees sur GHCR.</w:t>
+      </w:r>
+    </w:p>
+    <w:p>
+      <w:pPr>
+        <w:pStyle w:val="Heading2"/>
+      </w:pPr>
+      <w:r>
+        <w:t>Captures a prendre pour l'exercice 3</w:t>
+      </w:r>
+    </w:p>
+    <w:p>
+      <w:r>
+        <w:rPr>
+          <w:i/>
+        </w:rPr>
+        <w:t>Toutes les commandes ci-dessous sont a executer depuis la racine du projet :</w:t>
+      </w:r>
+    </w:p>
+    <w:tbl>
+      <w:tblPr>
+        <w:tblW w:type="auto" w:w="0"/>
+        <w:tblLook w:firstColumn="1" w:firstRow="1" w:lastColumn="0" w:lastRow="0" w:noHBand="0" w:noVBand="1" w:val="04A0"/>
+      </w:tblPr>
+      <w:tblGrid>
+        <w:gridCol w:w="9360"/>
+      </w:tblGrid>
+      <w:tr>
+        <w:tc>
+          <w:tcPr>
+            <w:tcW w:type="dxa" w:w="9360"/>
+            <w:shd w:val="clear" w:color="auto" w:fill="F7F7F7"/>
+          </w:tcPr>
+          <w:p>
+            <w:r/>
+            <w:r>
+              <w:rPr>
+                <w:rFonts w:ascii="Consolas" w:hAnsi="Consolas"/>
+                <w:sz w:val="20"/>
+              </w:rPr>
+              <w:t>cd /Users/hugorivaux/Projet_Cours_Dev/rendu-infra/esgi-2603-my-favorite-places</w:t>
+            </w:r>
+          </w:p>
+        </w:tc>
+      </w:tr>
+    </w:tbl>
+    <w:tbl>
+      <w:tblPr>
+        <w:tblStyle w:val="TableGrid"/>
+        <w:tblW w:type="auto" w:w="0"/>
+        <w:tblLook w:firstColumn="1" w:firstRow="1" w:lastColumn="0" w:lastRow="0" w:noHBand="0" w:noVBand="1" w:val="04A0"/>
+      </w:tblPr>
+      <w:tblGrid>
+        <w:gridCol w:w="9360"/>
+      </w:tblGrid>
+      <w:tr>
+        <w:tc>
+          <w:tcPr>
+            <w:tcW w:type="dxa" w:w="9360"/>
+            <w:shd w:val="clear" w:color="auto" w:fill="F2F2F2"/>
+          </w:tcPr>
+          <w:p>
+            <w:r/>
+            <w:r>
+              <w:rPr>
+                <w:b/>
+              </w:rPr>
+              <w:t>Capture 10 - Images publiees sur GHCR</w:t>
+            </w:r>
+          </w:p>
+        </w:tc>
+      </w:tr>
+      <w:tr>
+        <w:tc>
+          <w:tcPr>
+            <w:tcW w:type="dxa" w:w="9360"/>
+          </w:tcPr>
+          <w:p>
+            <w:r>
+              <w:t>Ouvrir https://github.com/Hrivaux?tab=packages dans un navigateur. La page doit montrer les deux packages mfp-docker-ci-server et mfp-docker-ci-client. Faire une capture (Cmd+Shift+4) de la fenetre du navigateur. -&gt; A coller juste sous ce tableau.</w:t>
+            </w:r>
+          </w:p>
+        </w:tc>
+      </w:tr>
+    </w:tbl>
+    <w:p>
+      <w:r>
+        <w:rPr>
+          <w:i/>
+          <w:color w:val="808080"/>
+          <w:sz w:val="20"/>
+        </w:rPr>
+        <w:t>[ Coller ici la capture d'ecran ]</w:t>
+      </w:r>
+    </w:p>
+    <w:p/>
+    <w:tbl>
+      <w:tblPr>
+        <w:tblStyle w:val="TableGrid"/>
+        <w:tblW w:type="auto" w:w="0"/>
+        <w:tblLook w:firstColumn="1" w:firstRow="1" w:lastColumn="0" w:lastRow="0" w:noHBand="0" w:noVBand="1" w:val="04A0"/>
+      </w:tblPr>
+      <w:tblGrid>
+        <w:gridCol w:w="9360"/>
+      </w:tblGrid>
+      <w:tr>
+        <w:tc>
+          <w:tcPr>
+            <w:tcW w:type="dxa" w:w="9360"/>
+            <w:shd w:val="clear" w:color="auto" w:fill="F2F2F2"/>
+          </w:tcPr>
+          <w:p>
+            <w:r/>
+            <w:r>
+              <w:rPr>
+                <w:b/>
+              </w:rPr>
+              <w:t>Capture 11 - compose.prod.yml</w:t>
+            </w:r>
+          </w:p>
+        </w:tc>
+      </w:tr>
+      <w:tr>
+        <w:tc>
+          <w:tcPr>
+            <w:tcW w:type="dxa" w:w="9360"/>
+          </w:tcPr>
+          <w:p>
+            <w:r>
+              <w:t>Ouvrir compose.prod.yml dans VS Code et capturer la fenetre. Les directives image: ghcr.io/hrivaux/mfp-docker-ci-server:latest et image: ghcr.io/hrivaux/mfp-docker-ci-client:latest doivent etre visibles, ainsi que l'absence totale de build:. -&gt; A coller juste sous ce tableau.</w:t>
+            </w:r>
+          </w:p>
+        </w:tc>
+      </w:tr>
+    </w:tbl>
+    <w:p>
+      <w:r>
+        <w:rPr>
+          <w:i/>
+          <w:color w:val="808080"/>
+          <w:sz w:val="20"/>
+        </w:rPr>
+        <w:t>[ Coller ici la capture d'ecran ]</w:t>
+      </w:r>
+    </w:p>
+    <w:p/>
+    <w:tbl>
+      <w:tblPr>
+        <w:tblStyle w:val="TableGrid"/>
+        <w:tblW w:type="auto" w:w="0"/>
+        <w:tblLook w:firstColumn="1" w:firstRow="1" w:lastColumn="0" w:lastRow="0" w:noHBand="0" w:noVBand="1" w:val="04A0"/>
+      </w:tblPr>
+      <w:tblGrid>
+        <w:gridCol w:w="9360"/>
+      </w:tblGrid>
+      <w:tr>
+        <w:tc>
+          <w:tcPr>
+            <w:tcW w:type="dxa" w:w="9360"/>
+            <w:shd w:val="clear" w:color="auto" w:fill="F2F2F2"/>
+          </w:tcPr>
+          <w:p>
+            <w:r/>
+            <w:r>
+              <w:rPr>
+                <w:b/>
+              </w:rPr>
+              <w:t>Capture 12 - Pull des images depuis GHCR</w:t>
+            </w:r>
+          </w:p>
+        </w:tc>
+      </w:tr>
+      <w:tr>
+        <w:tc>
+          <w:tcPr>
+            <w:tcW w:type="dxa" w:w="9360"/>
+          </w:tcPr>
+          <w:p>
+            <w:r>
+              <w:t>Dans le terminal, lancer : docker compose -f compose.prod.yml pull. Capturer le terminal : on doit voir les lignes Pulling client/server/db suivies de Pulled. Cela prouve que les images sont recuperees depuis ghcr.io et non construites localement. -&gt; A coller juste sous ce tableau.</w:t>
+            </w:r>
+          </w:p>
+        </w:tc>
+      </w:tr>
+    </w:tbl>
+    <w:p>
+      <w:r>
+        <w:rPr>
+          <w:i/>
+          <w:color w:val="808080"/>
+          <w:sz w:val="20"/>
+        </w:rPr>
+        <w:t>[ Coller ici la capture d'ecran ]</w:t>
+      </w:r>
+    </w:p>
+    <w:p/>
+    <w:tbl>
+      <w:tblPr>
+        <w:tblStyle w:val="TableGrid"/>
+        <w:tblW w:type="auto" w:w="0"/>
+        <w:tblLook w:firstColumn="1" w:firstRow="1" w:lastColumn="0" w:lastRow="0" w:noHBand="0" w:noVBand="1" w:val="04A0"/>
+      </w:tblPr>
+      <w:tblGrid>
+        <w:gridCol w:w="9360"/>
+      </w:tblGrid>
+      <w:tr>
+        <w:tc>
+          <w:tcPr>
+            <w:tcW w:type="dxa" w:w="9360"/>
+            <w:shd w:val="clear" w:color="auto" w:fill="F2F2F2"/>
+          </w:tcPr>
+          <w:p>
+            <w:r/>
+            <w:r>
+              <w:rPr>
+                <w:b/>
+              </w:rPr>
+              <w:t>Capture 13 - Demarrage de la stack de production</w:t>
+            </w:r>
+          </w:p>
+        </w:tc>
+      </w:tr>
+      <w:tr>
+        <w:tc>
+          <w:tcPr>
+            <w:tcW w:type="dxa" w:w="9360"/>
+          </w:tcPr>
+          <w:p>
+            <w:r>
+              <w:t>Lancer : docker compose down puis docker compose -f compose.prod.yml up -d. Capturer le terminal : on doit voir Container ...-db-1 Healthy, puis ...-server-1 Started et ...-client-1 Started. Aucune ligne Building ne doit apparaitre. -&gt; A coller juste sous ce tableau.</w:t>
+            </w:r>
+          </w:p>
+        </w:tc>
+      </w:tr>
+    </w:tbl>
+    <w:p>
+      <w:r>
+        <w:rPr>
+          <w:i/>
+          <w:color w:val="808080"/>
+          <w:sz w:val="20"/>
+        </w:rPr>
+        <w:t>[ Coller ici la capture d'ecran ]</w:t>
+      </w:r>
+    </w:p>
+    <w:p/>
+    <w:tbl>
+      <w:tblPr>
+        <w:tblStyle w:val="TableGrid"/>
+        <w:tblW w:type="auto" w:w="0"/>
+        <w:tblLook w:firstColumn="1" w:firstRow="1" w:lastColumn="0" w:lastRow="0" w:noHBand="0" w:noVBand="1" w:val="04A0"/>
+      </w:tblPr>
+      <w:tblGrid>
+        <w:gridCol w:w="9360"/>
+      </w:tblGrid>
+      <w:tr>
+        <w:tc>
+          <w:tcPr>
+            <w:tcW w:type="dxa" w:w="9360"/>
+            <w:shd w:val="clear" w:color="auto" w:fill="F2F2F2"/>
+          </w:tcPr>
+          <w:p>
+            <w:r/>
+            <w:r>
+              <w:rPr>
+                <w:b/>
+              </w:rPr>
+              <w:t>Capture 14 - Etat des conteneurs (docker compose ps)</w:t>
+            </w:r>
+          </w:p>
+        </w:tc>
+      </w:tr>
+      <w:tr>
+        <w:tc>
+          <w:tcPr>
+            <w:tcW w:type="dxa" w:w="9360"/>
+          </w:tcPr>
+          <w:p>
+            <w:r>
+              <w:t>Lancer : docker compose -f compose.prod.yml ps. Capturer la sortie. La colonne IMAGE doit afficher ghcr.io/hrivaux/mfp-docker-ci-client:latest et ghcr.io/hrivaux/mfp-docker-ci-server:latest, et tous les services en STATUS Up (db en Up (healthy)). -&gt; A coller juste sous ce tableau.</w:t>
+            </w:r>
+          </w:p>
+        </w:tc>
+      </w:tr>
+    </w:tbl>
+    <w:p>
+      <w:r>
+        <w:rPr>
+          <w:i/>
+          <w:color w:val="808080"/>
+          <w:sz w:val="20"/>
+        </w:rPr>
+        <w:t>[ Coller ici la capture d'ecran ]</w:t>
+      </w:r>
+    </w:p>
+    <w:p/>
+    <w:tbl>
+      <w:tblPr>
+        <w:tblStyle w:val="TableGrid"/>
+        <w:tblW w:type="auto" w:w="0"/>
+        <w:tblLook w:firstColumn="1" w:firstRow="1" w:lastColumn="0" w:lastRow="0" w:noHBand="0" w:noVBand="1" w:val="04A0"/>
+      </w:tblPr>
+      <w:tblGrid>
+        <w:gridCol w:w="9360"/>
+      </w:tblGrid>
+      <w:tr>
+        <w:tc>
+          <w:tcPr>
+            <w:tcW w:type="dxa" w:w="9360"/>
+            <w:shd w:val="clear" w:color="auto" w:fill="F2F2F2"/>
+          </w:tcPr>
+          <w:p>
+            <w:r/>
+            <w:r>
+              <w:rPr>
+                <w:b/>
+              </w:rPr>
+              <w:t>Capture 15 - Logs du serveur (connexion BDD OK)</w:t>
+            </w:r>
+          </w:p>
+        </w:tc>
+      </w:tr>
+      <w:tr>
+        <w:tc>
+          <w:tcPr>
+            <w:tcW w:type="dxa" w:w="9360"/>
+          </w:tcPr>
+          <w:p>
+            <w:r>
+              <w:t>Lancer : docker compose -f compose.prod.yml logs server | tail -n 20. Capturer le terminal. Les deux dernieres lignes utiles doivent etre connected to PgSQL db et server started on port 3000. Cela prouve que l'image serveur tiree de GHCR demarre correctement. -&gt; A coller juste sous ce tableau.</w:t>
+            </w:r>
+          </w:p>
+        </w:tc>
+      </w:tr>
+    </w:tbl>
+    <w:p>
+      <w:r>
+        <w:rPr>
+          <w:i/>
+          <w:color w:val="808080"/>
+          <w:sz w:val="20"/>
+        </w:rPr>
+        <w:t>[ Coller ici la capture d'ecran ]</w:t>
+      </w:r>
+    </w:p>
+    <w:p/>
+    <w:tbl>
+      <w:tblPr>
+        <w:tblStyle w:val="TableGrid"/>
+        <w:tblW w:type="auto" w:w="0"/>
+        <w:tblLook w:firstColumn="1" w:firstRow="1" w:lastColumn="0" w:lastRow="0" w:noHBand="0" w:noVBand="1" w:val="04A0"/>
+      </w:tblPr>
+      <w:tblGrid>
+        <w:gridCol w:w="9360"/>
+      </w:tblGrid>
+      <w:tr>
+        <w:tc>
+          <w:tcPr>
+            <w:tcW w:type="dxa" w:w="9360"/>
+            <w:shd w:val="clear" w:color="auto" w:fill="F2F2F2"/>
+          </w:tcPr>
+          <w:p>
+            <w:r/>
+            <w:r>
+              <w:rPr>
+                <w:b/>
+              </w:rPr>
+              <w:t>Capture 16 - Front accessible dans le navigateur</w:t>
+            </w:r>
+          </w:p>
+        </w:tc>
+      </w:tr>
+      <w:tr>
+        <w:tc>
+          <w:tcPr>
+            <w:tcW w:type="dxa" w:w="9360"/>
+          </w:tcPr>
+          <w:p>
+            <w:r>
+              <w:t>Ouvrir http://localhost:8080 dans un navigateur. Capturer la fenetre avec l'URL et la page React de l'application chargee. Cela prouve que l'image client (Nginx) tiree de GHCR fonctionne. -&gt; A coller juste sous ce tableau.</w:t>
+            </w:r>
+          </w:p>
+        </w:tc>
+      </w:tr>
+    </w:tbl>
+    <w:p>
+      <w:r>
+        <w:rPr>
+          <w:i/>
+          <w:color w:val="808080"/>
+          <w:sz w:val="20"/>
+        </w:rPr>
+        <w:t>[ Coller ici la capture d'ecran ]</w:t>
+      </w:r>
+    </w:p>
+    <w:p/>
+    <w:tbl>
+      <w:tblPr>
+        <w:tblStyle w:val="TableGrid"/>
+        <w:tblW w:type="auto" w:w="0"/>
+        <w:tblLook w:firstColumn="1" w:firstRow="1" w:lastColumn="0" w:lastRow="0" w:noHBand="0" w:noVBand="1" w:val="04A0"/>
+      </w:tblPr>
+      <w:tblGrid>
+        <w:gridCol w:w="9360"/>
+      </w:tblGrid>
+      <w:tr>
+        <w:tc>
+          <w:tcPr>
+            <w:tcW w:type="dxa" w:w="9360"/>
+            <w:shd w:val="clear" w:color="auto" w:fill="F2F2F2"/>
+          </w:tcPr>
+          <w:p>
+            <w:r/>
+            <w:r>
+              <w:rPr>
+                <w:b/>
+              </w:rPr>
+              <w:t>Capture 17 - Test API (Bruno ou curl)</w:t>
+            </w:r>
+          </w:p>
+        </w:tc>
+      </w:tr>
+      <w:tr>
+        <w:tc>
+          <w:tcPr>
+            <w:tcW w:type="dxa" w:w="9360"/>
+          </w:tcPr>
+          <w:p>
+            <w:r>
+              <w:t>Soit lancer curl -i -X POST http://localhost:3001/api/users -H 'Content-Type: application/json' -d '{"email":"prod-test@example.com","password":"secret123"}' et capturer le terminal (HTTP/1.1 200 OK + JSON avec un id), soit refaire la requete dans Bruno et capturer la fenetre avec le statut 200 OK. Cela demontre que l'application end-to-end fonctionne avec les images de production. -&gt; A coller juste sous ce tableau.</w:t>
+            </w:r>
+          </w:p>
+        </w:tc>
+      </w:tr>
+    </w:tbl>
+    <w:p>
+      <w:r>
+        <w:rPr>
+          <w:i/>
+          <w:color w:val="808080"/>
+          <w:sz w:val="20"/>
+        </w:rPr>
+        <w:t>[ Coller ici la capture d'ecran ]</w:t>
+      </w:r>
+    </w:p>
+    <w:p/>
     <w:sectPr>
       <w:pgSz w:w="12240" w:h="15840"/>
       <w:pgMar w:top="1440" w:right="1440" w:bottom="1440" w:left="1440" w:header="720" w:footer="720" w:gutter="0"/>

</xml_diff>